<commit_message>
Prepare submission candidates for formal filing safety checks.
Add representative stamp space on the application form, fill appendix 1 fare metadata, extend screen evidence with meter fee supplement pages, and regenerate PDF/Word candidate sets.

Co-authored-by: Cursor <cursoragent@cursor.com>
</commit_message>
<xml_diff>
--- a/docs/submission/20260705/pre-fixed-fare-submission-appendix-set-v1-candidate.docx
+++ b/docs/submission/20260705/pre-fixed-fare-submission-appendix-set-v1-candidate.docx
@@ -3102,7 +3102,7 @@
                 <w:sz w:val="19"/>
                 <w:szCs w:val="19"/>
               </w:rPr>
-              <w:t xml:space="preserve">申請書本体・認可運賃表に基づき記入</w:t>
+              <w:t xml:space="preserve">22時から翌5時まで2割増</w:t>
             </w:r>
           </w:p>
         </w:tc>
@@ -3164,7 +3164,7 @@
                 <w:sz w:val="19"/>
                 <w:szCs w:val="19"/>
               </w:rPr>
-              <w:t xml:space="preserve">申請書本体・認可運賃表に基づき記入</w:t>
+              <w:t xml:space="preserve">身体障害者・知的障害者は1割引</w:t>
             </w:r>
           </w:p>
         </w:tc>
@@ -3226,7 +3226,7 @@
                 <w:sz w:val="19"/>
                 <w:szCs w:val="19"/>
               </w:rPr>
-              <w:t xml:space="preserve">申請書本体・認可運賃表に基づき記入</w:t>
+              <w:t xml:space="preserve">事前確定運賃算定時は1円未満の端数を四捨五入</w:t>
             </w:r>
           </w:p>
         </w:tc>
@@ -3288,7 +3288,7 @@
                 <w:sz w:val="19"/>
                 <w:szCs w:val="19"/>
               </w:rPr>
-              <w:t xml:space="preserve">申請書本体・認可運賃表に基づき記入</w:t>
+              <w:t xml:space="preserve">認可日以降、令和8年9月1日予定</w:t>
             </w:r>
           </w:p>
         </w:tc>

</xml_diff>